<commit_message>
Cơ chế trừ tiền / sửa số dư từ Admin (type === 'sub' / 扣款)
</commit_message>
<xml_diff>
--- a/sua.docx
+++ b/sua.docx
@@ -4,16 +4,11 @@
   <w:body>
     <w:p>
       <w:r>
-        <w:t>后台的这些都点不了，点了没有反应</w:t>
-      </w:r>
-    </w:p>
-    <w:p>
-      <w:r>
         <w:drawing>
-          <wp:inline distT="0" distB="0" distL="0" distR="0" wp14:anchorId="241FFB84" wp14:editId="7A00BA16">
-            <wp:extent cx="6496050" cy="1628775"/>
-            <wp:effectExtent l="0" t="0" r="0" b="9525"/>
-            <wp:docPr id="185312312" name="Picture 1"/>
+          <wp:inline distT="0" distB="0" distL="0" distR="0" wp14:anchorId="53222548" wp14:editId="70EB8EFC">
+            <wp:extent cx="6840220" cy="3227705"/>
+            <wp:effectExtent l="0" t="0" r="0" b="0"/>
+            <wp:docPr id="866271801" name="Picture 1"/>
             <wp:cNvGraphicFramePr>
               <a:graphicFrameLocks xmlns:a="http://schemas.openxmlformats.org/drawingml/2006/main" noChangeAspect="1"/>
             </wp:cNvGraphicFramePr>
@@ -21,7 +16,7 @@
               <a:graphicData uri="http://schemas.openxmlformats.org/drawingml/2006/picture">
                 <pic:pic xmlns:pic="http://schemas.openxmlformats.org/drawingml/2006/picture">
                   <pic:nvPicPr>
-                    <pic:cNvPr id="185312312" name=""/>
+                    <pic:cNvPr id="866271801" name=""/>
                     <pic:cNvPicPr/>
                   </pic:nvPicPr>
                   <pic:blipFill>
@@ -33,7 +28,7 @@
                   <pic:spPr>
                     <a:xfrm>
                       <a:off x="0" y="0"/>
-                      <a:ext cx="6496050" cy="1628775"/>
+                      <a:ext cx="6840220" cy="3227705"/>
                     </a:xfrm>
                     <a:prstGeom prst="rect">
                       <a:avLst/>
@@ -47,33 +42,19 @@
       </w:r>
     </w:p>
     <w:p>
-      <w:pPr>
-        <w:pBdr>
-          <w:bottom w:val="single" w:sz="6" w:space="1" w:color="auto"/>
-        </w:pBdr>
-      </w:pPr>
-    </w:p>
-    <w:p>
-      <w:r>
-        <w:t>这个出金默认的地址和银行卡信息去掉吧，我重新注册了一个也显示这些</w:t>
+      <w:r>
+        <w:t>无法更换照片，无法上传自己的照片</w:t>
       </w:r>
     </w:p>
     <w:p/>
     <w:p>
-      <w:pPr>
-        <w:pBdr>
-          <w:bottom w:val="single" w:sz="6" w:space="1" w:color="auto"/>
-        </w:pBdr>
-      </w:pPr>
-      <w:r>
-        <w:rPr>
-          <w:noProof/>
-        </w:rPr>
+      <w:r>
+        <w:lastRenderedPageBreak/>
         <w:drawing>
-          <wp:inline distT="0" distB="0" distL="0" distR="0" wp14:anchorId="3A172552" wp14:editId="5DDB180E">
-            <wp:extent cx="4448175" cy="4191000"/>
-            <wp:effectExtent l="0" t="0" r="9525" b="0"/>
-            <wp:docPr id="702430354" name="Picture 3"/>
+          <wp:inline distT="0" distB="0" distL="0" distR="0" wp14:anchorId="5B7AE9EE" wp14:editId="156D2A0D">
+            <wp:extent cx="6029325" cy="9382125"/>
+            <wp:effectExtent l="0" t="0" r="9525" b="9525"/>
+            <wp:docPr id="1672103417" name="Picture 1"/>
             <wp:cNvGraphicFramePr>
               <a:graphicFrameLocks xmlns:a="http://schemas.openxmlformats.org/drawingml/2006/main" noChangeAspect="1"/>
             </wp:cNvGraphicFramePr>
@@ -81,36 +62,23 @@
               <a:graphicData uri="http://schemas.openxmlformats.org/drawingml/2006/picture">
                 <pic:pic xmlns:pic="http://schemas.openxmlformats.org/drawingml/2006/picture">
                   <pic:nvPicPr>
-                    <pic:cNvPr id="0" name="Picture 3"/>
-                    <pic:cNvPicPr>
-                      <a:picLocks noChangeAspect="1" noChangeArrowheads="1"/>
-                    </pic:cNvPicPr>
+                    <pic:cNvPr id="1672103417" name=""/>
+                    <pic:cNvPicPr/>
                   </pic:nvPicPr>
                   <pic:blipFill>
-                    <a:blip r:embed="rId5">
-                      <a:extLst>
-                        <a:ext uri="{28A0092B-C50C-407E-A947-70E740481C1C}">
-                          <a14:useLocalDpi xmlns:a14="http://schemas.microsoft.com/office/drawing/2010/main" val="0"/>
-                        </a:ext>
-                      </a:extLst>
-                    </a:blip>
-                    <a:srcRect/>
+                    <a:blip r:embed="rId5"/>
                     <a:stretch>
                       <a:fillRect/>
                     </a:stretch>
                   </pic:blipFill>
-                  <pic:spPr bwMode="auto">
+                  <pic:spPr>
                     <a:xfrm>
                       <a:off x="0" y="0"/>
-                      <a:ext cx="4448175" cy="4191000"/>
+                      <a:ext cx="6029325" cy="9382125"/>
                     </a:xfrm>
                     <a:prstGeom prst="rect">
                       <a:avLst/>
                     </a:prstGeom>
-                    <a:noFill/>
-                    <a:ln>
-                      <a:noFill/>
-                    </a:ln>
                   </pic:spPr>
                 </pic:pic>
               </a:graphicData>
@@ -118,16 +86,46 @@
           </wp:inline>
         </w:drawing>
       </w:r>
-      <w:r>
-        <w:rPr>
-          <w:noProof/>
-        </w:rPr>
+    </w:p>
+    <w:p>
+      <w:r>
+        <w:t>我发现一个问题，如果我在后台充值资金，他的他为什么不会显示在入金明细和，资金记录里面</w:t>
+      </w:r>
+      <w:r>
+        <w:br/>
+      </w:r>
+      <w:r>
+        <w:br/>
+      </w:r>
+      <w:r>
         <w:lastRenderedPageBreak/>
+        <w:t>1.</w:t>
+      </w:r>
+      <w:r>
+        <w:t>我正常入金就需要显示在里面</w:t>
+      </w:r>
+      <w:r>
+        <w:br/>
+      </w:r>
+      <w:r>
+        <w:br/>
+        <w:t>2.</w:t>
+      </w:r>
+      <w:r>
+        <w:t>如果我修改余额就不需要显示，我记得你以前修改好了，但是现在又出现这个问题了</w:t>
+      </w:r>
+      <w:r>
+        <w:t>11:51</w:t>
+      </w:r>
+    </w:p>
+    <w:p/>
+    <w:p>
+      <w:r>
         <w:drawing>
-          <wp:inline distT="0" distB="0" distL="0" distR="0" wp14:anchorId="24FF98AD" wp14:editId="1A93330D">
-            <wp:extent cx="4410075" cy="3286125"/>
-            <wp:effectExtent l="0" t="0" r="9525" b="9525"/>
-            <wp:docPr id="1658623013" name="Picture 2"/>
+          <wp:inline distT="0" distB="0" distL="0" distR="0" wp14:anchorId="55B14A6F" wp14:editId="79376B39">
+            <wp:extent cx="6840220" cy="4446270"/>
+            <wp:effectExtent l="0" t="0" r="0" b="0"/>
+            <wp:docPr id="1990422644" name="Picture 1"/>
             <wp:cNvGraphicFramePr>
               <a:graphicFrameLocks xmlns:a="http://schemas.openxmlformats.org/drawingml/2006/main" noChangeAspect="1"/>
             </wp:cNvGraphicFramePr>
@@ -135,36 +133,23 @@
               <a:graphicData uri="http://schemas.openxmlformats.org/drawingml/2006/picture">
                 <pic:pic xmlns:pic="http://schemas.openxmlformats.org/drawingml/2006/picture">
                   <pic:nvPicPr>
-                    <pic:cNvPr id="0" name="Picture 2"/>
-                    <pic:cNvPicPr>
-                      <a:picLocks noChangeAspect="1" noChangeArrowheads="1"/>
-                    </pic:cNvPicPr>
+                    <pic:cNvPr id="1990422644" name=""/>
+                    <pic:cNvPicPr/>
                   </pic:nvPicPr>
                   <pic:blipFill>
-                    <a:blip r:embed="rId6">
-                      <a:extLst>
-                        <a:ext uri="{28A0092B-C50C-407E-A947-70E740481C1C}">
-                          <a14:useLocalDpi xmlns:a14="http://schemas.microsoft.com/office/drawing/2010/main" val="0"/>
-                        </a:ext>
-                      </a:extLst>
-                    </a:blip>
-                    <a:srcRect/>
+                    <a:blip r:embed="rId6"/>
                     <a:stretch>
                       <a:fillRect/>
                     </a:stretch>
                   </pic:blipFill>
-                  <pic:spPr bwMode="auto">
+                  <pic:spPr>
                     <a:xfrm>
                       <a:off x="0" y="0"/>
-                      <a:ext cx="4410075" cy="3286125"/>
+                      <a:ext cx="6840220" cy="4446270"/>
                     </a:xfrm>
                     <a:prstGeom prst="rect">
                       <a:avLst/>
                     </a:prstGeom>
-                    <a:noFill/>
-                    <a:ln>
-                      <a:noFill/>
-                    </a:ln>
                   </pic:spPr>
                 </pic:pic>
               </a:graphicData>
@@ -173,14 +158,17 @@
         </w:drawing>
       </w:r>
       <w:r>
-        <w:rPr>
-          <w:noProof/>
-        </w:rPr>
+        <w:t>第二个问题，无法保存</w:t>
+      </w:r>
+    </w:p>
+    <w:p>
+      <w:r>
+        <w:lastRenderedPageBreak/>
         <w:drawing>
-          <wp:inline distT="0" distB="0" distL="0" distR="0" wp14:anchorId="7C90EF2C" wp14:editId="091B76D5">
-            <wp:extent cx="4210050" cy="3143250"/>
-            <wp:effectExtent l="0" t="0" r="0" b="0"/>
-            <wp:docPr id="1818487211" name="Picture 1"/>
+          <wp:inline distT="0" distB="0" distL="0" distR="0" wp14:anchorId="14C93DA5" wp14:editId="074EA34F">
+            <wp:extent cx="5810250" cy="7381875"/>
+            <wp:effectExtent l="0" t="0" r="0" b="9525"/>
+            <wp:docPr id="1587965346" name="Picture 1"/>
             <wp:cNvGraphicFramePr>
               <a:graphicFrameLocks xmlns:a="http://schemas.openxmlformats.org/drawingml/2006/main" noChangeAspect="1"/>
             </wp:cNvGraphicFramePr>
@@ -188,36 +176,23 @@
               <a:graphicData uri="http://schemas.openxmlformats.org/drawingml/2006/picture">
                 <pic:pic xmlns:pic="http://schemas.openxmlformats.org/drawingml/2006/picture">
                   <pic:nvPicPr>
-                    <pic:cNvPr id="0" name="Picture 1"/>
-                    <pic:cNvPicPr>
-                      <a:picLocks noChangeAspect="1" noChangeArrowheads="1"/>
-                    </pic:cNvPicPr>
+                    <pic:cNvPr id="1587965346" name=""/>
+                    <pic:cNvPicPr/>
                   </pic:nvPicPr>
                   <pic:blipFill>
-                    <a:blip r:embed="rId7">
-                      <a:extLst>
-                        <a:ext uri="{28A0092B-C50C-407E-A947-70E740481C1C}">
-                          <a14:useLocalDpi xmlns:a14="http://schemas.microsoft.com/office/drawing/2010/main" val="0"/>
-                        </a:ext>
-                      </a:extLst>
-                    </a:blip>
-                    <a:srcRect/>
+                    <a:blip r:embed="rId7"/>
                     <a:stretch>
                       <a:fillRect/>
                     </a:stretch>
                   </pic:blipFill>
-                  <pic:spPr bwMode="auto">
+                  <pic:spPr>
                     <a:xfrm>
                       <a:off x="0" y="0"/>
-                      <a:ext cx="4210050" cy="3143250"/>
+                      <a:ext cx="5810250" cy="7381875"/>
                     </a:xfrm>
                     <a:prstGeom prst="rect">
                       <a:avLst/>
                     </a:prstGeom>
-                    <a:noFill/>
-                    <a:ln>
-                      <a:noFill/>
-                    </a:ln>
                   </pic:spPr>
                 </pic:pic>
               </a:graphicData>
@@ -225,15 +200,21 @@
           </wp:inline>
         </w:drawing>
       </w:r>
+      <w:r>
+        <w:t>第三个问题，点击他，会跳转</w:t>
+      </w:r>
+      <w:r>
+        <w:t>404</w:t>
+      </w:r>
     </w:p>
     <w:p>
       <w:r>
         <w:lastRenderedPageBreak/>
         <w:drawing>
-          <wp:inline distT="0" distB="0" distL="0" distR="0" wp14:anchorId="64A0AB0E" wp14:editId="02CF184C">
-            <wp:extent cx="4400550" cy="5629275"/>
-            <wp:effectExtent l="0" t="0" r="0" b="9525"/>
-            <wp:docPr id="1798958834" name="Picture 1"/>
+          <wp:inline distT="0" distB="0" distL="0" distR="0" wp14:anchorId="2ACFB56F" wp14:editId="75A5C2AC">
+            <wp:extent cx="6840220" cy="4533265"/>
+            <wp:effectExtent l="0" t="0" r="0" b="635"/>
+            <wp:docPr id="542939505" name="Picture 1"/>
             <wp:cNvGraphicFramePr>
               <a:graphicFrameLocks xmlns:a="http://schemas.openxmlformats.org/drawingml/2006/main" noChangeAspect="1"/>
             </wp:cNvGraphicFramePr>
@@ -241,7 +222,7 @@
               <a:graphicData uri="http://schemas.openxmlformats.org/drawingml/2006/picture">
                 <pic:pic xmlns:pic="http://schemas.openxmlformats.org/drawingml/2006/picture">
                   <pic:nvPicPr>
-                    <pic:cNvPr id="1798958834" name=""/>
+                    <pic:cNvPr id="542939505" name=""/>
                     <pic:cNvPicPr/>
                   </pic:nvPicPr>
                   <pic:blipFill>
@@ -253,7 +234,7 @@
                   <pic:spPr>
                     <a:xfrm>
                       <a:off x="0" y="0"/>
-                      <a:ext cx="4400550" cy="5629275"/>
+                      <a:ext cx="6840220" cy="4533265"/>
                     </a:xfrm>
                     <a:prstGeom prst="rect">
                       <a:avLst/>
@@ -265,13 +246,50 @@
           </wp:inline>
         </w:drawing>
       </w:r>
+      <w:r>
+        <w:lastRenderedPageBreak/>
+        <w:drawing>
+          <wp:inline distT="0" distB="0" distL="0" distR="0" wp14:anchorId="23FF5493" wp14:editId="155C5F7A">
+            <wp:extent cx="5639587" cy="5410955"/>
+            <wp:effectExtent l="0" t="0" r="0" b="0"/>
+            <wp:docPr id="523092656" name="Picture 1"/>
+            <wp:cNvGraphicFramePr>
+              <a:graphicFrameLocks xmlns:a="http://schemas.openxmlformats.org/drawingml/2006/main" noChangeAspect="1"/>
+            </wp:cNvGraphicFramePr>
+            <a:graphic xmlns:a="http://schemas.openxmlformats.org/drawingml/2006/main">
+              <a:graphicData uri="http://schemas.openxmlformats.org/drawingml/2006/picture">
+                <pic:pic xmlns:pic="http://schemas.openxmlformats.org/drawingml/2006/picture">
+                  <pic:nvPicPr>
+                    <pic:cNvPr id="523092656" name=""/>
+                    <pic:cNvPicPr/>
+                  </pic:nvPicPr>
+                  <pic:blipFill>
+                    <a:blip r:embed="rId9"/>
+                    <a:stretch>
+                      <a:fillRect/>
+                    </a:stretch>
+                  </pic:blipFill>
+                  <pic:spPr>
+                    <a:xfrm>
+                      <a:off x="0" y="0"/>
+                      <a:ext cx="5639587" cy="5410955"/>
+                    </a:xfrm>
+                    <a:prstGeom prst="rect">
+                      <a:avLst/>
+                    </a:prstGeom>
+                  </pic:spPr>
+                </pic:pic>
+              </a:graphicData>
+            </a:graphic>
+          </wp:inline>
+        </w:drawing>
+      </w:r>
     </w:p>
     <w:p>
       <w:r>
-        <w:t>而且现在是客户填写不了的</w:t>
+        <w:t>你的后台修改，都连接不到前台的</w:t>
       </w:r>
     </w:p>
-    <w:p/>
     <w:sectPr>
       <w:pgSz w:w="11906" w:h="16838"/>
       <w:pgMar w:top="567" w:right="567" w:bottom="567" w:left="567" w:header="851" w:footer="992" w:gutter="0"/>

</xml_diff>